<commit_message>
Align D2 assignment and add VS Code test task
</commit_message>
<xml_diff>
--- a/docs/Bảng phân công tổng thể_CapNhat.docx
+++ b/docs/Bảng phân công tổng thể_CapNhat.docx
@@ -302,7 +302,7 @@
               <w:spacing w:before="100" w:after="200" w:line="276" w:lineRule="auto"/>
             </w:pPr>
             <w:r>
-              <w:t>Queue</w:t>
+              <w:t>Queue FIFO theo từng sách (đặt chỗ)</w:t>
             </w:r>
           </w:p>
         </w:tc>
@@ -316,7 +316,7 @@
               <w:spacing w:before="100" w:after="200" w:line="276" w:lineRule="auto"/>
             </w:pPr>
             <w:r>
-              <w:t>MinHeap (chỉnh thành indexed heap)</w:t>
+              <w:t>Indexed max-heap theo borrowCount</w:t>
             </w:r>
           </w:p>
         </w:tc>
@@ -330,7 +330,7 @@
               <w:spacing w:before="100" w:after="200" w:line="276" w:lineRule="auto"/>
             </w:pPr>
             <w:r>
-              <w:t>Indexed heap theo borrowCount (max-heap cho Top K)</w:t>
+              <w:t>vector&lt;Activity&gt; có sẵn (giới hạn 1.000)</w:t>
             </w:r>
           </w:p>
         </w:tc>
@@ -510,7 +510,10 @@
               <w:spacing w:before="100" w:after="200" w:line="276" w:lineRule="auto"/>
             </w:pPr>
             <w:r>
-              <w:t>Q1–Q4 cho yêu cầu 2 + Mục 5.4: xung đột MC1 (HashTable) và Top K (indexed max-heap); Queue là yêu cầu riêng.</w:t>
+              <w:t xml:space="preserve">Q1–Q4 cho yêu cầu </w:t>
+            </w:r>
+            <w:r>
+              <w:t>3</w:t>
             </w:r>
           </w:p>
         </w:tc>
@@ -586,7 +589,7 @@
               <w:spacing w:before="100" w:after="200" w:line="276" w:lineRule="auto"/>
             </w:pPr>
             <w:r>
-              <w:t>MinHeapTest.cpp</w:t>
+              <w:t>MinHeapTest.cpp (indexed max-heap)</w:t>
             </w:r>
           </w:p>
         </w:tc>
@@ -600,7 +603,7 @@
               <w:spacing w:before="100" w:after="200" w:line="276" w:lineRule="auto"/>
             </w:pPr>
             <w:r>
-              <w:t>Test cho Activity/CircularQueue (tạo file mới)</w:t>
+              <w:t>ActivityTest.cpp mới (giới hạn, thứ tự mới nhất, K)</w:t>
             </w:r>
           </w:p>
         </w:tc>
@@ -656,7 +659,7 @@
               <w:spacing w:before="100" w:after="200" w:line="276" w:lineRule="auto"/>
             </w:pPr>
             <w:r>
-              <w:t>main.cpp/presentation</w:t>
+              <w:t>JsonDatabase (persistence) + main.cpp/presentation, vì ít phụ thuộc người khác nhất nên rảnh sớm để làm phần tích hợp cuối</w:t>
             </w:r>
           </w:p>
         </w:tc>
@@ -672,15 +675,6 @@
             <w:r>
               <w:t>Merge Pull Request, quản lý repo GitHub</w:t>
             </w:r>
-            <w:r>
-              <w:t xml:space="preserve">, </w:t>
-            </w:r>
-            <w:r>
-              <w:t>main.cpp/presentation</w:t>
-            </w:r>
-            <w:r>
-              <w:t>.</w:t>
-            </w:r>
           </w:p>
         </w:tc>
         <w:tc>
@@ -692,9 +686,6 @@
             <w:pPr>
               <w:spacing w:before="100" w:after="200" w:line="276" w:lineRule="auto"/>
             </w:pPr>
-            <w:r>
-              <w:t>JsonDatabase (persistence)</w:t>
-            </w:r>
           </w:p>
         </w:tc>
       </w:tr>

</xml_diff>